<commit_message>
Uplaod The New Schema
</commit_message>
<xml_diff>
--- a/Power Bi/Documents/DataDose_Dimensional_Model_Snowsight_Dashboard_Guide.docx
+++ b/Power Bi/Documents/DataDose_Dimensional_Model_Snowsight_Dashboard_Guide.docx
@@ -655,6 +655,38 @@
     </w:p>
     <w:p>
       <w:pPr>
+        <w:pStyle w:val="Heading3"/>
+      </w:pPr>
+      <w:r>
+        <w:t xml:space="preserve">5.9  How Live Data Actually Arrives — The PySpark Streaming Pipeline</w:t>
+      </w:r>
+    </w:p>
+    <w:p>
+      <w:pPr>
+        <w:spacing w:after="160"/>
+      </w:pPr>
+      <w:r>
+        <w:t xml:space="preserve">A Databricks PySpark Structured Streaming job reads prescription events from an Aiven Kafka topic, calls a Neo4j AuraDB graph on each micro-batch to look up drug-drug interactions, computes drug- and patient-level risk scores, and writes the enriched rows straight into STAGING.STG_TRANSACTION using the Snowflake Spark connector — no intermediate file or manual load step. Records that fail schema parsing are routed to a separate dead-letter stream that also lands in STAGING.STG_TRANSACTION, so nothing from the source topic is silently dropped.</w:t>
+      </w:r>
+    </w:p>
+    <w:p>
+      <w:pPr>
+        <w:spacing w:after="160"/>
+      </w:pPr>
+      <w:r>
+        <w:t xml:space="preserve">Because Databricks serverless compute doesn't support the continuous processingTime trigger, the pipeline runs with trigger(availableNow=True): each run drains everything currently sitting on the Kafka topic in one or more micro-batches and then stops on its own — isActive becoming False means the drain finished, not that the pipeline failed. Re-running the streaming cell (or scheduling it as a Job) is what picks up new messages; it does not poll continuously in the background.</w:t>
+      </w:r>
+    </w:p>
+    <w:p>
+      <w:pPr>
+        <w:spacing w:after="160"/>
+      </w:pPr>
+      <w:r>
+        <w:t xml:space="preserve">Practical effect for dashboarding: STAGING.STG_TRANSACTION is the freshest table in the whole schema — it holds rows the moment PySpark writes them, before anything is cast, deduplicated, or promoted into FACT_PRESCRIPTION_TRANSACTION or the ANALYTICS rollups. A tile that needs to reflect "what just happened" reads from STAGING.STG_TRANSACTION directly; a tile that needs clean, typed, joinable history reads from the FACT/ANALYTICS layer once the promotion step has run.</w:t>
+      </w:r>
+    </w:p>
+    <w:p>
+      <w:pPr>
         <w:pStyle w:val="Heading1"/>
       </w:pPr>
       <w:r>
@@ -790,6 +822,19 @@
       </w:pPr>
       <w:r>
         <w:t xml:space="preserve">Add a filter (top-right “Filter” button) bound to a date range or pharmacy name — Snowsight filters can apply across every tile on the dashboard at once if each tile's query references the same filter field.</w:t>
+      </w:r>
+    </w:p>
+    <w:p>
+      <w:pPr>
+        <w:pStyle w:val="ListParagraph"/>
+        <w:numPr>
+          <w:ilvl w:val="0"/>
+          <w:numId w:val="2"/>
+        </w:numPr>
+        <w:spacing w:after="80"/>
+      </w:pPr>
+      <w:r>
+        <w:t xml:space="preserve">For a live/streaming tile (e.g. a running feed of the newest fills as the PySpark job writes them), point the query at STAGING.STG_TRANSACTION instead of FACT_PRESCRIPTION_TRANSACTION, order by LOAD_TIMESTAMP descending, and exclude dry-run rows with a filter such as BATCH_ID NOT LIKE 'KAFKA-9999-%'. Set that tile's dashboard refresh interval to roughly match how often the streaming job actually runs (i.e. how often the availableNow trigger is re-invoked), since a faster refresh than the ingestion cadence just re-shows the same rows.</w:t>
       </w:r>
     </w:p>
     <w:p>

</xml_diff>

<commit_message>
updata  power BI home
</commit_message>
<xml_diff>
--- a/Power Bi/Documents/DataDose_Dimensional_Model_Snowsight_Dashboard_Guide.docx
+++ b/Power Bi/Documents/DataDose_Dimensional_Model_Snowsight_Dashboard_Guide.docx
@@ -655,6 +655,38 @@
     </w:p>
     <w:p>
       <w:pPr>
+        <w:pStyle w:val="Heading3"/>
+      </w:pPr>
+      <w:r>
+        <w:t xml:space="preserve">5.9  How Live Data Actually Arrives — The PySpark Streaming Pipeline</w:t>
+      </w:r>
+    </w:p>
+    <w:p>
+      <w:pPr>
+        <w:spacing w:after="160"/>
+      </w:pPr>
+      <w:r>
+        <w:t xml:space="preserve">A Databricks PySpark Structured Streaming job reads prescription events from an Aiven Kafka topic, calls a Neo4j AuraDB graph on each micro-batch to look up drug-drug interactions, computes drug- and patient-level risk scores, and writes the enriched rows straight into STAGING.STG_TRANSACTION using the Snowflake Spark connector — no intermediate file or manual load step. Records that fail schema parsing are routed to a separate dead-letter stream that also lands in STAGING.STG_TRANSACTION, so nothing from the source topic is silently dropped.</w:t>
+      </w:r>
+    </w:p>
+    <w:p>
+      <w:pPr>
+        <w:spacing w:after="160"/>
+      </w:pPr>
+      <w:r>
+        <w:t xml:space="preserve">Because Databricks serverless compute doesn't support the continuous processingTime trigger, the pipeline runs with trigger(availableNow=True): each run drains everything currently sitting on the Kafka topic in one or more micro-batches and then stops on its own — isActive becoming False means the drain finished, not that the pipeline failed. Re-running the streaming cell (or scheduling it as a Job) is what picks up new messages; it does not poll continuously in the background.</w:t>
+      </w:r>
+    </w:p>
+    <w:p>
+      <w:pPr>
+        <w:spacing w:after="160"/>
+      </w:pPr>
+      <w:r>
+        <w:t xml:space="preserve">Practical effect for dashboarding: STAGING.STG_TRANSACTION is the freshest table in the whole schema — it holds rows the moment PySpark writes them, before anything is cast, deduplicated, or promoted into FACT_PRESCRIPTION_TRANSACTION or the ANALYTICS rollups. A tile that needs to reflect "what just happened" reads from STAGING.STG_TRANSACTION directly; a tile that needs clean, typed, joinable history reads from the FACT/ANALYTICS layer once the promotion step has run.</w:t>
+      </w:r>
+    </w:p>
+    <w:p>
+      <w:pPr>
         <w:pStyle w:val="Heading1"/>
       </w:pPr>
       <w:r>
@@ -790,6 +822,19 @@
       </w:pPr>
       <w:r>
         <w:t xml:space="preserve">Add a filter (top-right “Filter” button) bound to a date range or pharmacy name — Snowsight filters can apply across every tile on the dashboard at once if each tile's query references the same filter field.</w:t>
+      </w:r>
+    </w:p>
+    <w:p>
+      <w:pPr>
+        <w:pStyle w:val="ListParagraph"/>
+        <w:numPr>
+          <w:ilvl w:val="0"/>
+          <w:numId w:val="2"/>
+        </w:numPr>
+        <w:spacing w:after="80"/>
+      </w:pPr>
+      <w:r>
+        <w:t xml:space="preserve">For a live/streaming tile (e.g. a running feed of the newest fills as the PySpark job writes them), point the query at STAGING.STG_TRANSACTION instead of FACT_PRESCRIPTION_TRANSACTION, order by LOAD_TIMESTAMP descending, and exclude dry-run rows with a filter such as BATCH_ID NOT LIKE 'KAFKA-9999-%'. Set that tile's dashboard refresh interval to roughly match how often the streaming job actually runs (i.e. how often the availableNow trigger is re-invoked), since a faster refresh than the ingestion cadence just re-shows the same rows.</w:t>
       </w:r>
     </w:p>
     <w:p>

</xml_diff>